<commit_message>
Fix Q5a mode hint, Exp2 question gap note, Table 3 shading note
</commit_message>
<xml_diff>
--- a/Labs/ECE332_Lab5_Waveguides.docx
+++ b/Labs/ECE332_Lab5_Waveguides.docx
@@ -660,6 +660,18 @@
           <w:sz w:val="22"/>
         </w:rPr>
         <w:t>Table 1: Waveguide SWR minima/maxima positions and calculated quantities.</w:t>
+      </w:r>
+    </w:p>
+    <w:p>
+      <w:pPr>
+        <w:spacing w:after="80"/>
+      </w:pPr>
+      <w:r>
+        <w:rPr>
+          <w:i w:val="0"/>
+          <w:sz w:val="22"/>
+        </w:rPr>
+        <w:t>Shading note (matches original Table 3): λg, vp, vg are calculated only from minima positions (Eq. 7: λg = 4Δd). Leave those columns blank on Max rows — the gray shading in the original indicates non-applicable cells.</w:t>
       </w:r>
     </w:p>
     <w:tbl>
@@ -2025,7 +2037,19 @@
           <w:i w:val="0"/>
           <w:sz w:val="22"/>
         </w:rPr>
-        <w:t>(a) Using measured a and b, the three lowest cutoff frequencies from Eq. 3:</w:t>
+        <w:t>(a) IMPORTANT — the lab warns the three lowest modes may NOT be sequential m, n values. Use Eq. 3 to compute f_c for every candidate (m, n) pair, then rank them to find the actual three lowest. The general rule: TM requires m ≥ 1 AND n ≥ 1; TE allows either index to be zero (but not both). Whether TE₀₁ or TE₂₀ ranks second depends entirely on the ratio a/b — check both.</w:t>
+      </w:r>
+    </w:p>
+    <w:p>
+      <w:pPr>
+        <w:spacing w:after="80"/>
+      </w:pPr>
+      <w:r>
+        <w:rPr>
+          <w:i w:val="0"/>
+          <w:sz w:val="22"/>
+        </w:rPr>
+        <w:t>Candidate modes to evaluate with measured a and b:</w:t>
       </w:r>
     </w:p>
     <w:p>
@@ -2037,7 +2061,7 @@
         <w:rPr>
           <w:sz w:val="22"/>
         </w:rPr>
-        <w:t>TE₁₀:  f_c = c/(2a) = _______ GHz</w:t>
+        <w:t>TE₁₀:  f_c = c/(2a)                      = _______ GHz  ← always lowest</w:t>
       </w:r>
     </w:p>
     <w:p>
@@ -2049,7 +2073,7 @@
         <w:rPr>
           <w:sz w:val="22"/>
         </w:rPr>
-        <w:t>TE₂₀:  f_c = c/a  = _______ GHz</w:t>
+        <w:t>TE₂₀:  f_c = c/a                          = _______ GHz</w:t>
       </w:r>
     </w:p>
     <w:p>
@@ -2061,7 +2085,19 @@
         <w:rPr>
           <w:sz w:val="22"/>
         </w:rPr>
-        <w:t>TE₀₁:  f_c = c/(2b) = _______ GHz</w:t>
+        <w:t>TE₀₁:  f_c = c/(2b)                       = _______ GHz</w:t>
+      </w:r>
+    </w:p>
+    <w:p>
+      <w:pPr>
+        <w:pStyle w:val="ListBullet"/>
+        <w:spacing w:after="40"/>
+      </w:pPr>
+      <w:r>
+        <w:rPr>
+          <w:sz w:val="22"/>
+        </w:rPr>
+        <w:t>TE₁₁ / TM₁₁:  f_c = (c/2)√(1/a² + 1/b²) = _______ GHz</w:t>
       </w:r>
     </w:p>
     <w:p>
@@ -2073,7 +2109,19 @@
           <w:i w:val="0"/>
           <w:sz w:val="22"/>
         </w:rPr>
-        <w:t>(b) Modes propagating at f = 11 GHz, 9.5 GHz, 8.5 GHz (f &gt; f_c required):</w:t>
+        <w:t>Rank the four values above from lowest to highest — the top three are your answer. Note: for the standard X-band waveguide (a ≈ 2b) the order is TE₁₀ &lt; TE₂₀ &lt; TE₀₁, but confirm with your actual a and b measurements.</w:t>
+      </w:r>
+    </w:p>
+    <w:p>
+      <w:pPr>
+        <w:spacing w:after="80"/>
+      </w:pPr>
+      <w:r>
+        <w:rPr>
+          <w:i w:val="0"/>
+          <w:sz w:val="22"/>
+        </w:rPr>
+        <w:t>(b) Modes propagating at each frequency (f &gt; f_c required):</w:t>
       </w:r>
     </w:p>
     <w:p>
@@ -2086,7 +2134,7 @@
           <w:color w:val="888888"/>
           <w:sz w:val="22"/>
         </w:rPr>
-        <w:t>[List which modes satisfy f &gt; f_c for each operating frequency]</w:t>
+        <w:t>[For each operating frequency 11/9.5/8.5 GHz, list every mode whose f_c is below that frequency. At 11 GHz all three lowest modes likely propagate; at lower frequencies some may be cut off.]</w:t>
       </w:r>
     </w:p>
     <w:p>
@@ -2098,7 +2146,7 @@
           <w:i w:val="0"/>
           <w:sz w:val="22"/>
         </w:rPr>
-        <w:t>(c) Using measured λg and free-space λ = c/f, back-calculate f_c via f_c = f √(1−(λ/λg)²) and compare to the geometric values from part (a):</w:t>
+        <w:t>(c) Using free-space λ = c/f, average measured λg, and Eq. 5, back-calculate f_c via:  f_c = f √(1 − (λ/λg)²)  and compare to the geometric values from (a):</w:t>
       </w:r>
     </w:p>
     <w:p>
@@ -2111,7 +2159,7 @@
           <w:color w:val="888888"/>
           <w:sz w:val="22"/>
         </w:rPr>
-        <w:t>[Fill in recalculated f_c values and discuss agreement/discrepancy]</w:t>
+        <w:t>[Fill in one f_c per operating frequency. Agreement within ~5% is typical; larger discrepancy suggests probe loading or scale-reading error.]</w:t>
       </w:r>
     </w:p>
     <w:p>
@@ -2549,6 +2597,18 @@
     </w:p>
     <w:p>
       <w:pPr>
+        <w:spacing w:after="80"/>
+      </w:pPr>
+      <w:r>
+        <w:rPr>
+          <w:i w:val="0"/>
+          <w:sz w:val="22"/>
+        </w:rPr>
+        <w:t>NOTE: The lab PDF (page 13) cuts off Experiment 2 Question 1 mid-sentence. Check your physical handout for the complete question list and update the placeholders below accordingly.</w:t>
+      </w:r>
+    </w:p>
+    <w:p>
+      <w:pPr>
         <w:spacing w:before="160" w:after="40"/>
       </w:pPr>
       <w:r>
@@ -2556,7 +2616,7 @@
           <w:b/>
           <w:sz w:val="24"/>
         </w:rPr>
-        <w:t>Q1 — Phase velocity comparison between Experiment 2 and Experiment 1</w:t>
+        <w:t>Q1 — Phase velocity: vp = λg · f  (lab PDF question, partially visible)</w:t>
       </w:r>
     </w:p>
     <w:p>
@@ -2568,7 +2628,55 @@
           <w:i w:val="0"/>
           <w:sz w:val="22"/>
         </w:rPr>
-        <w:t>Using the cavity-measured frequency f_meas and the average λg from Experiment 1, the phase velocity is vp = λg · f_meas. Compare this to the vp calculated in Experiment 1 from Eq. 5:</w:t>
+        <w:t>The full question reads: "Using the measured values for frequency and wavelength, calculate the phase velocity of the wave: vp = λg · f. How close (i.e. percentage difference) is this to your values from [Experiment 1]?"</w:t>
+      </w:r>
+    </w:p>
+    <w:p>
+      <w:pPr>
+        <w:spacing w:after="80"/>
+      </w:pPr>
+      <w:r>
+        <w:rPr>
+          <w:i w:val="0"/>
+          <w:sz w:val="22"/>
+        </w:rPr>
+        <w:t>Using the cavity-measured frequency f_meas and the average λg from Experiment 1:</w:t>
+      </w:r>
+    </w:p>
+    <w:p>
+      <w:pPr>
+        <w:pStyle w:val="ListBullet"/>
+        <w:spacing w:after="40"/>
+      </w:pPr>
+      <w:r>
+        <w:rPr>
+          <w:sz w:val="22"/>
+        </w:rPr>
+        <w:t>vp = λg(avg, 11 GHz) × f_meas(11 GHz)  = _______ m/s</w:t>
+      </w:r>
+    </w:p>
+    <w:p>
+      <w:pPr>
+        <w:pStyle w:val="ListBullet"/>
+        <w:spacing w:after="40"/>
+      </w:pPr>
+      <w:r>
+        <w:rPr>
+          <w:sz w:val="22"/>
+        </w:rPr>
+        <w:t>vp = λg(avg, 9.5 GHz) × f_meas(9.5 GHz) = _______ m/s</w:t>
+      </w:r>
+    </w:p>
+    <w:p>
+      <w:pPr>
+        <w:pStyle w:val="ListBullet"/>
+        <w:spacing w:after="40"/>
+      </w:pPr>
+      <w:r>
+        <w:rPr>
+          <w:sz w:val="22"/>
+        </w:rPr>
+        <w:t>vp = λg(avg, 8.5 GHz) × f_meas(8.5 GHz) = _______ m/s</w:t>
       </w:r>
     </w:p>
     <w:p>
@@ -2581,7 +2689,7 @@
           <w:color w:val="888888"/>
           <w:sz w:val="22"/>
         </w:rPr>
-        <w:t>[Compute vp for each frequency, find % difference from Experiment 1, and discuss sources of discrepancy such as probe loading, vernier scale reading error, or oscillator frequency drift]</w:t>
+        <w:t>[Compute % difference = |vp_Exp2 − vp_Exp1| / vp_Exp1 × 100% for each frequency. Discuss sources of discrepancy: oscillator frequency drift, vernier scale reading error, probe loading effects.]</w:t>
       </w:r>
     </w:p>
     <w:p>
@@ -2593,19 +2701,7 @@
           <w:b/>
           <w:sz w:val="24"/>
         </w:rPr>
-        <w:t>Q2 — Group velocity comparison</w:t>
-      </w:r>
-    </w:p>
-    <w:p>
-      <w:pPr>
-        <w:spacing w:after="80"/>
-      </w:pPr>
-      <w:r>
-        <w:rPr>
-          <w:i w:val="0"/>
-          <w:sz w:val="22"/>
-        </w:rPr>
-        <w:t>Using vg = c²/vp, compute the group velocity for each frequency. Compare to Experiment 1 values and check that vp · vg ≈ c²:</w:t>
+        <w:t>Q2 — (verify full question from your handout)</w:t>
       </w:r>
     </w:p>
     <w:p>
@@ -2618,7 +2714,7 @@
           <w:color w:val="888888"/>
           <w:sz w:val="22"/>
         </w:rPr>
-        <w:t>[Fill in vg values and percentage differences]</w:t>
+        <w:t>[Write the complete question text here, then answer it. Likely asks about group velocity or comparing measured frequency to oscillator setting.]</w:t>
       </w:r>
     </w:p>
     <w:p>
@@ -2630,7 +2726,7 @@
           <w:b/>
           <w:sz w:val="24"/>
         </w:rPr>
-        <w:t>Q3 — Resonant cavity as a bandpass filter</w:t>
+        <w:t>Q3 — (verify full question from your handout)</w:t>
       </w:r>
     </w:p>
     <w:p>
@@ -2639,10 +2735,11 @@
       </w:pPr>
       <w:r>
         <w:rPr>
-          <w:i w:val="0"/>
+          <w:i/>
+          <w:color w:val="888888"/>
           <w:sz w:val="22"/>
         </w:rPr>
-        <w:t>Explain how tuning the resonant cavity allows it to select a specific frequency. The cavity dimensions set the resonant frequency. When the signal frequency matches the resonance, the cavity maximally absorbs energy, producing a sharp drop in the SWR. Adjusting the cavity tunes it to match the signal, acting as a narrow bandpass filter centered on the measured frequency.</w:t>
+        <w:t>[Write the complete question text here, then answer it.]</w:t>
       </w:r>
     </w:p>
     <w:sectPr>

</xml_diff>

<commit_message>
Fill in all Exp1 calculations from recorded data
</commit_message>
<xml_diff>
--- a/Labs/ECE332_Lab5_Waveguides.docx
+++ b/Labs/ECE332_Lab5_Waveguides.docx
@@ -17,7 +17,6 @@
     </w:p>
     <w:p>
       <w:pPr>
-        <w:spacing w:after="120"/>
         <w:jc w:val="center"/>
       </w:pPr>
       <w:r>
@@ -37,7 +36,7 @@
         <w:t xml:space="preserve">Author: </w:t>
       </w:r>
       <w:r>
-        <w:t>Bao Nguyen, [Lab Partner Name]</w:t>
+        <w:t>Bao Nguyen, Nick Stites</w:t>
       </w:r>
     </w:p>
     <w:p>
@@ -63,7 +62,6 @@
       </w:pPr>
       <w:r>
         <w:rPr>
-          <w:i w:val="0"/>
           <w:sz w:val="22"/>
         </w:rPr>
         <w:t>Reading: Sections 8-6 through 8-11 in Ulaby. Equipment: Systron/Donner 5000 Sweeper/Oscillator and HP 415E SWR Meter.</w:t>
@@ -99,7 +97,6 @@
       </w:pPr>
       <w:r>
         <w:rPr>
-          <w:i w:val="0"/>
           <w:sz w:val="22"/>
         </w:rPr>
         <w:t>Answer: (a) Rectangular Waveguides and (d) Optical Fiber</w:t>
@@ -111,7 +108,6 @@
       </w:pPr>
       <w:r>
         <w:rPr>
-          <w:i w:val="0"/>
           <w:sz w:val="22"/>
         </w:rPr>
         <w:t>TEM waves require two distinct conductors so the transverse electric field can terminate on separated charges. A rectangular waveguide has only one conductor (the metallic pipe), so there is no return path for transverse current — TEM cannot exist. Only TE and TM modes propagate inside. Optical fibers guide light by total internal reflection between dielectric layers; with no conducting boundaries to enforce TEM boundary conditions, they support hybrid HE/EH modes, not TEM. Coaxial cables and parallel-plate lines both have two conductors and do support TEM propagation.</w:t>
@@ -135,7 +131,6 @@
       </w:pPr>
       <w:r>
         <w:rPr>
-          <w:i w:val="0"/>
           <w:sz w:val="22"/>
         </w:rPr>
         <w:t>Answer: (d) TM₁₁</w:t>
@@ -147,7 +142,6 @@
       </w:pPr>
       <w:r>
         <w:rPr>
-          <w:i w:val="0"/>
           <w:sz w:val="22"/>
         </w:rPr>
         <w:t>For TM modes in a rectangular waveguide the boundary condition Ez = 0 on all four walls requires both mode indices m ≥ 1 and n ≥ 1 (a zero index forces the entire field to vanish). Therefore TM₀₀, TM₁₀, and TM₀₁ do not physically exist. The lowest-order TM mode that satisfies the boundary conditions is TM₁₁, making it the dominant TM mode.</w:t>
@@ -171,7 +165,6 @@
       </w:pPr>
       <w:r>
         <w:rPr>
-          <w:i w:val="0"/>
           <w:sz w:val="22"/>
         </w:rPr>
         <w:t>Answer: (b) TE₁₀</w:t>
@@ -183,7 +176,6 @@
       </w:pPr>
       <w:r>
         <w:rPr>
-          <w:i w:val="0"/>
           <w:sz w:val="22"/>
         </w:rPr>
         <w:t>For TE modes, Hz ≠ 0 and either index may be zero (but not both simultaneously). The cutoff frequency is f_c = (c/2)√((m/a)² + (n/b)²). For a waveguide with a &gt; b, the smallest cutoff occurs when m = 1, n = 0, giving f_c(TE₁₀) = c/(2a). This is lower than all other TE or TM modes, so TE₁₀ is the dominant (lowest-frequency) mode of a rectangular waveguide.</w:t>
@@ -207,7 +199,6 @@
       </w:pPr>
       <w:r>
         <w:rPr>
-          <w:i w:val="0"/>
           <w:sz w:val="22"/>
         </w:rPr>
         <w:t>Answer: (d) Bandpass</w:t>
@@ -219,10 +210,9 @@
       </w:pPr>
       <w:r>
         <w:rPr>
-          <w:i w:val="0"/>
           <w:sz w:val="22"/>
         </w:rPr>
-        <w:t>A resonant cavity has a specific resonant frequency determined by its geometry. It strongly absorbs (or transmits, depending on coupling) only signals near that resonant frequency, attenuating all others. In Experiment 3.2, when the cavity resonates the SWR meter reading drops sharply — the cavity "notches out" energy at one narrow frequency, which is the signature of a bandpass (or notch-reject) behavior. From the perspective of what frequencies are passed to the load, the cavity acts as a bandpass filter.</w:t>
+        <w:t>A resonant cavity has a specific resonant frequency determined by its geometry. It strongly absorbs (or transmits, depending on coupling) only signals near that resonant frequency, attenuating all others. In Experiment 3.2, when the cavity resonates the SWR meter reading drops sharply — the cavity "notches out" energy at one narrow frequency, which is the signature of bandpass behavior. From the perspective of what frequencies are passed to the load, the cavity acts as a bandpass filter.</w:t>
       </w:r>
     </w:p>
     <w:p>
@@ -243,7 +233,6 @@
       </w:pPr>
       <w:r>
         <w:rPr>
-          <w:i w:val="0"/>
           <w:sz w:val="22"/>
         </w:rPr>
         <w:t>Answer: (b) Hewlett Packard 415E</w:t>
@@ -255,7 +244,6 @@
       </w:pPr>
       <w:r>
         <w:rPr>
-          <w:i w:val="0"/>
           <w:sz w:val="22"/>
         </w:rPr>
         <w:t>The HP 415E is the SWR Meter — a high-gain amplifier tuned to 1 kHz that reads the modulated microwave signal detected by the probe. The Systron/Donner 5000 is the sweeper/oscillator (microwave signal source), not a measurement instrument.</w:t>
@@ -296,7 +284,6 @@
       </w:pPr>
       <w:r>
         <w:rPr>
-          <w:i w:val="0"/>
           <w:sz w:val="22"/>
         </w:rPr>
         <w:t>Measure the standing-wave pattern inside a slotted rectangular waveguide at three input frequencies (11 GHz, 9.5 GHz, 8.5 GHz) using a traveling probe and SWR meter. From the minima/maxima positions calculate the waveguide wavelength λg, phase velocity vp, and group velocity vg for each frequency. Also measure the physical dimensions a and b of the waveguide and use them to compute the cutoff frequencies of the three lowest modes.</w:t>
@@ -320,7 +307,6 @@
       </w:pPr>
       <w:r>
         <w:rPr>
-          <w:i w:val="0"/>
           <w:sz w:val="22"/>
         </w:rPr>
         <w:t>In a two-conductor transmission line, the electric field is transverse to the direction of propagation, giving rise to TEM waves. A hollow metallic waveguide has only one conductor, so TEM waves cannot propagate. Instead, TE and TM modes exist, each with a minimum (cutoff) frequency below which the mode is evanescent.</w:t>
@@ -332,7 +318,6 @@
       </w:pPr>
       <w:r>
         <w:rPr>
-          <w:i w:val="0"/>
           <w:sz w:val="22"/>
         </w:rPr>
         <w:t>For a rectangular waveguide with inner width a (along x) and height b (along y), the cutoff frequency of the TE_mn / TM_mn mode is:</w:t>
@@ -344,10 +329,9 @@
       </w:pPr>
       <w:r>
         <w:rPr>
-          <w:i w:val="0"/>
           <w:sz w:val="22"/>
         </w:rPr>
-        <w:t xml:space="preserve">    f_c = f_mn = (1 / 2√(με)) √((m/a)² + (n/b)²)     [Eq. 3]</w:t>
+        <w:t xml:space="preserve">    f_c = (1 / 2√(με)) √((m/a)² + (n/b)²)     [Eq. 3]</w:t>
       </w:r>
     </w:p>
     <w:p>
@@ -356,7 +340,6 @@
       </w:pPr>
       <w:r>
         <w:rPr>
-          <w:i w:val="0"/>
           <w:sz w:val="22"/>
         </w:rPr>
         <w:t>The dominant mode is TE₁₀ (m=1, n=0) with f_c = c/(2a). For propagation to occur, the operating frequency f must exceed f_c.</w:t>
@@ -368,10 +351,9 @@
       </w:pPr>
       <w:r>
         <w:rPr>
-          <w:i w:val="0"/>
           <w:sz w:val="22"/>
         </w:rPr>
-        <w:t>Inside the waveguide the wave bounces at an angle between the walls, producing a standing wave along z when the far end is short-circuited. The waveguide wavelength λg — the axial distance between successive field maxima — is longer than the free-space wavelength λ = c/f:</w:t>
+        <w:t>Inside the waveguide the wave bounces at an angle between the walls, producing a standing wave along z when the far end is short-circuited. The waveguide wavelength λg is longer than the free-space wavelength λ = c/f:</w:t>
       </w:r>
     </w:p>
     <w:p>
@@ -380,7 +362,6 @@
       </w:pPr>
       <w:r>
         <w:rPr>
-          <w:i w:val="0"/>
           <w:sz w:val="22"/>
         </w:rPr>
         <w:t xml:space="preserve">    λg = 2π / β = 2π / √(ω²με − (mπ/a)² − (nπ/b)²)     [Eq. 4]</w:t>
@@ -392,7 +373,6 @@
       </w:pPr>
       <w:r>
         <w:rPr>
-          <w:i w:val="0"/>
           <w:sz w:val="22"/>
         </w:rPr>
         <w:t>The phase velocity (speed of the phase front along z) is:</w:t>
@@ -404,10 +384,9 @@
       </w:pPr>
       <w:r>
         <w:rPr>
-          <w:i w:val="0"/>
           <w:sz w:val="22"/>
         </w:rPr>
-        <w:t xml:space="preserve">    vp = f λg = c λ / (λ √(μr εr) √(1 − (fc/f)²)) = vp0 / √(1 − (fc/f)²)     [Eq. 5]</w:t>
+        <w:t xml:space="preserve">    vp = f λg = vp0 / √(1 − (fc/f)²)     [Eq. 5]</w:t>
       </w:r>
     </w:p>
     <w:p>
@@ -416,7 +395,6 @@
       </w:pPr>
       <w:r>
         <w:rPr>
-          <w:i w:val="0"/>
           <w:sz w:val="22"/>
         </w:rPr>
         <w:t>Note vp &gt; c; it carries no information. The group velocity (information/energy speed) is:</w:t>
@@ -428,7 +406,6 @@
       </w:pPr>
       <w:r>
         <w:rPr>
-          <w:i w:val="0"/>
           <w:sz w:val="22"/>
         </w:rPr>
         <w:t xml:space="preserve">    vg = vp0 √(1 − (fc/f)²) = (1/√με)(λ/λg)     [Eq. 6]</w:t>
@@ -440,7 +417,6 @@
       </w:pPr>
       <w:r>
         <w:rPr>
-          <w:i w:val="0"/>
           <w:sz w:val="22"/>
         </w:rPr>
         <w:t>Note: vp · vg = c² (for air-filled guide), so vg &lt; c.</w:t>
@@ -452,10 +428,9 @@
       </w:pPr>
       <w:r>
         <w:rPr>
-          <w:i w:val="0"/>
           <w:sz w:val="22"/>
         </w:rPr>
-        <w:t>The waveguide wavelength is measured by finding successive minima of the standing wave pattern. Between two consecutive minima the probe travels λg/2, so:</w:t>
+        <w:t>The waveguide wavelength is measured from successive minima/maxima. Each consecutive min↔max pair is λg/4 apart:</w:t>
       </w:r>
     </w:p>
     <w:p>
@@ -464,7 +439,6 @@
       </w:pPr>
       <w:r>
         <w:rPr>
-          <w:i w:val="0"/>
           <w:sz w:val="22"/>
         </w:rPr>
         <w:t xml:space="preserve">    λg = 4Δd = 4(d_{n+1} − d_n)     [Eq. 7]</w:t>
@@ -488,7 +462,6 @@
       </w:pPr>
       <w:r>
         <w:rPr>
-          <w:i w:val="0"/>
           <w:sz w:val="22"/>
         </w:rPr>
         <w:t>Equipment used:</w:t>
@@ -560,10 +533,9 @@
       </w:pPr>
       <w:r>
         <w:rPr>
-          <w:i w:val="0"/>
           <w:sz w:val="22"/>
         </w:rPr>
-        <w:t>The short-circuit termination was attached to the output of the slotted waveguide. The probe on the carriage was connected to the SWR meter. The sweeper/oscillator was set to 11 GHz (2F-C marker knob), RF Level 5–10 mW, "1 kHz" switch ON. The probe penetration depth was tuned so the maximum SWR deflection fell within the mid-scale range (RANGE-DB set to 30–40 dB). Measurements were then repeated for 9.5 GHz and 8.5 GHz.</w:t>
+        <w:t>The short-circuit termination was attached to the output of the slotted waveguide. The probe was connected to the SWR meter. The sweeper/oscillator was set to 11 GHz (2F-C knob), RF Level 5–10 mW, "1 kHz" switch ON. Probe penetration depth was tuned for mid-scale deflection (RANGE-DB 30–40 dB). Measurements were repeated for 9.5 GHz and 8.5 GHz.</w:t>
       </w:r>
     </w:p>
     <w:p>
@@ -623,7 +595,7 @@
         <w:rPr>
           <w:sz w:val="22"/>
         </w:rPr>
-        <w:t>vg = vp0 √(1−(fc/f)²)  — group velocity (Eq. 6)</w:t>
+        <w:t>vg = vp0 √(1−(fc/f)²) = c²/vp  — group velocity (Eq. 6)</w:t>
       </w:r>
     </w:p>
     <w:p>
@@ -635,7 +607,7 @@
         <w:rPr>
           <w:sz w:val="22"/>
         </w:rPr>
-        <w:t>λg = 4Δd = 4(d_{n+1}−dn)  — λg from probe position data (Eq. 7)</w:t>
+        <w:t>λg = 4Δd  — λg from consecutive min/max positions (Eq. 7)</w:t>
       </w:r>
     </w:p>
     <w:p>
@@ -656,7 +628,6 @@
       </w:pPr>
       <w:r>
         <w:rPr>
-          <w:i w:val="0"/>
           <w:sz w:val="22"/>
         </w:rPr>
         <w:t>Table 1: Waveguide SWR minima/maxima positions and calculated quantities.</w:t>
@@ -668,10 +639,9 @@
       </w:pPr>
       <w:r>
         <w:rPr>
-          <w:i w:val="0"/>
           <w:sz w:val="22"/>
         </w:rPr>
-        <w:t>Shading note (matches original Table 3): λg, vp, vg are calculated only from minima positions (Eq. 7: λg = 4Δd). Leave those columns blank on Max rows — the gray shading in the original indicates non-applicable cells.</w:t>
+        <w:t>Note: λg, vp, vg calculated only for Min rows using λg = 4×|Min_n − Max_n|. Average row uses all 5 consecutive Δd pairs.</w:t>
       </w:r>
     </w:p>
     <w:tbl>
@@ -804,7 +774,7 @@
           </w:tcPr>
           <w:p>
             <w:r>
-              <w:t xml:space="preserve">    Min 1</w:t>
+              <w:t xml:space="preserve">  Min 1</w:t>
             </w:r>
           </w:p>
         </w:tc>
@@ -813,7 +783,9 @@
             <w:tcW w:type="dxa" w:w="1728"/>
           </w:tcPr>
           <w:p>
-            <w:r/>
+            <w:r>
+              <w:t>170.1</w:t>
+            </w:r>
           </w:p>
         </w:tc>
         <w:tc>
@@ -821,7 +793,9 @@
             <w:tcW w:type="dxa" w:w="1728"/>
           </w:tcPr>
           <w:p>
-            <w:r/>
+            <w:r>
+              <w:t>31.2</w:t>
+            </w:r>
           </w:p>
         </w:tc>
         <w:tc>
@@ -829,7 +803,9 @@
             <w:tcW w:type="dxa" w:w="1728"/>
           </w:tcPr>
           <w:p>
-            <w:r/>
+            <w:r>
+              <w:t>3.432e+08</w:t>
+            </w:r>
           </w:p>
         </w:tc>
         <w:tc>
@@ -837,7 +813,9 @@
             <w:tcW w:type="dxa" w:w="1728"/>
           </w:tcPr>
           <w:p>
-            <w:r/>
+            <w:r>
+              <w:t>2.622e+08</w:t>
+            </w:r>
           </w:p>
         </w:tc>
       </w:tr>
@@ -848,7 +826,7 @@
           </w:tcPr>
           <w:p>
             <w:r>
-              <w:t xml:space="preserve">    Max 1</w:t>
+              <w:t xml:space="preserve">  Max 1</w:t>
             </w:r>
           </w:p>
         </w:tc>
@@ -857,7 +835,9 @@
             <w:tcW w:type="dxa" w:w="1728"/>
           </w:tcPr>
           <w:p>
-            <w:r/>
+            <w:r>
+              <w:t>162.3</w:t>
+            </w:r>
           </w:p>
         </w:tc>
         <w:tc>
@@ -865,7 +845,9 @@
             <w:tcW w:type="dxa" w:w="1728"/>
           </w:tcPr>
           <w:p>
-            <w:r/>
+            <w:r>
+              <w:t>—</w:t>
+            </w:r>
           </w:p>
         </w:tc>
         <w:tc>
@@ -873,7 +855,9 @@
             <w:tcW w:type="dxa" w:w="1728"/>
           </w:tcPr>
           <w:p>
-            <w:r/>
+            <w:r>
+              <w:t>—</w:t>
+            </w:r>
           </w:p>
         </w:tc>
         <w:tc>
@@ -881,7 +865,9 @@
             <w:tcW w:type="dxa" w:w="1728"/>
           </w:tcPr>
           <w:p>
-            <w:r/>
+            <w:r>
+              <w:t>—</w:t>
+            </w:r>
           </w:p>
         </w:tc>
       </w:tr>
@@ -892,7 +878,7 @@
           </w:tcPr>
           <w:p>
             <w:r>
-              <w:t xml:space="preserve">    Min 2</w:t>
+              <w:t xml:space="preserve">  Min 2</w:t>
             </w:r>
           </w:p>
         </w:tc>
@@ -901,7 +887,9 @@
             <w:tcW w:type="dxa" w:w="1728"/>
           </w:tcPr>
           <w:p>
-            <w:r/>
+            <w:r>
+              <w:t>153.3</w:t>
+            </w:r>
           </w:p>
         </w:tc>
         <w:tc>
@@ -909,7 +897,9 @@
             <w:tcW w:type="dxa" w:w="1728"/>
           </w:tcPr>
           <w:p>
-            <w:r/>
+            <w:r>
+              <w:t>32.4</w:t>
+            </w:r>
           </w:p>
         </w:tc>
         <w:tc>
@@ -917,7 +907,9 @@
             <w:tcW w:type="dxa" w:w="1728"/>
           </w:tcPr>
           <w:p>
-            <w:r/>
+            <w:r>
+              <w:t>3.564e+08</w:t>
+            </w:r>
           </w:p>
         </w:tc>
         <w:tc>
@@ -925,7 +917,9 @@
             <w:tcW w:type="dxa" w:w="1728"/>
           </w:tcPr>
           <w:p>
-            <w:r/>
+            <w:r>
+              <w:t>2.525e+08</w:t>
+            </w:r>
           </w:p>
         </w:tc>
       </w:tr>
@@ -936,7 +930,7 @@
           </w:tcPr>
           <w:p>
             <w:r>
-              <w:t xml:space="preserve">    Max 2</w:t>
+              <w:t xml:space="preserve">  Max 2</w:t>
             </w:r>
           </w:p>
         </w:tc>
@@ -945,7 +939,9 @@
             <w:tcW w:type="dxa" w:w="1728"/>
           </w:tcPr>
           <w:p>
-            <w:r/>
+            <w:r>
+              <w:t>145.2</w:t>
+            </w:r>
           </w:p>
         </w:tc>
         <w:tc>
@@ -953,7 +949,9 @@
             <w:tcW w:type="dxa" w:w="1728"/>
           </w:tcPr>
           <w:p>
-            <w:r/>
+            <w:r>
+              <w:t>—</w:t>
+            </w:r>
           </w:p>
         </w:tc>
         <w:tc>
@@ -961,7 +959,9 @@
             <w:tcW w:type="dxa" w:w="1728"/>
           </w:tcPr>
           <w:p>
-            <w:r/>
+            <w:r>
+              <w:t>—</w:t>
+            </w:r>
           </w:p>
         </w:tc>
         <w:tc>
@@ -969,7 +969,9 @@
             <w:tcW w:type="dxa" w:w="1728"/>
           </w:tcPr>
           <w:p>
-            <w:r/>
+            <w:r>
+              <w:t>—</w:t>
+            </w:r>
           </w:p>
         </w:tc>
       </w:tr>
@@ -980,7 +982,7 @@
           </w:tcPr>
           <w:p>
             <w:r>
-              <w:t xml:space="preserve">    Min 3</w:t>
+              <w:t xml:space="preserve">  Min 3</w:t>
             </w:r>
           </w:p>
         </w:tc>
@@ -989,7 +991,9 @@
             <w:tcW w:type="dxa" w:w="1728"/>
           </w:tcPr>
           <w:p>
-            <w:r/>
+            <w:r>
+              <w:t>136.6</w:t>
+            </w:r>
           </w:p>
         </w:tc>
         <w:tc>
@@ -997,7 +1001,9 @@
             <w:tcW w:type="dxa" w:w="1728"/>
           </w:tcPr>
           <w:p>
-            <w:r/>
+            <w:r>
+              <w:t>29.6</w:t>
+            </w:r>
           </w:p>
         </w:tc>
         <w:tc>
@@ -1005,7 +1011,9 @@
             <w:tcW w:type="dxa" w:w="1728"/>
           </w:tcPr>
           <w:p>
-            <w:r/>
+            <w:r>
+              <w:t>3.256e+08</w:t>
+            </w:r>
           </w:p>
         </w:tc>
         <w:tc>
@@ -1013,7 +1021,9 @@
             <w:tcW w:type="dxa" w:w="1728"/>
           </w:tcPr>
           <w:p>
-            <w:r/>
+            <w:r>
+              <w:t>2.764e+08</w:t>
+            </w:r>
           </w:p>
         </w:tc>
       </w:tr>
@@ -1024,7 +1034,7 @@
           </w:tcPr>
           <w:p>
             <w:r>
-              <w:t xml:space="preserve">    Max 3</w:t>
+              <w:t xml:space="preserve">  Max 3</w:t>
             </w:r>
           </w:p>
         </w:tc>
@@ -1033,7 +1043,9 @@
             <w:tcW w:type="dxa" w:w="1728"/>
           </w:tcPr>
           <w:p>
-            <w:r/>
+            <w:r>
+              <w:t>129.2</w:t>
+            </w:r>
           </w:p>
         </w:tc>
         <w:tc>
@@ -1041,7 +1053,9 @@
             <w:tcW w:type="dxa" w:w="1728"/>
           </w:tcPr>
           <w:p>
-            <w:r/>
+            <w:r>
+              <w:t>—</w:t>
+            </w:r>
           </w:p>
         </w:tc>
         <w:tc>
@@ -1049,7 +1063,9 @@
             <w:tcW w:type="dxa" w:w="1728"/>
           </w:tcPr>
           <w:p>
-            <w:r/>
+            <w:r>
+              <w:t>—</w:t>
+            </w:r>
           </w:p>
         </w:tc>
         <w:tc>
@@ -1057,7 +1073,9 @@
             <w:tcW w:type="dxa" w:w="1728"/>
           </w:tcPr>
           <w:p>
-            <w:r/>
+            <w:r>
+              <w:t>—</w:t>
+            </w:r>
           </w:p>
         </w:tc>
       </w:tr>
@@ -1085,7 +1103,9 @@
             <w:tcW w:type="dxa" w:w="1728"/>
           </w:tcPr>
           <w:p>
-            <w:r/>
+            <w:r>
+              <w:t>32.7</w:t>
+            </w:r>
           </w:p>
         </w:tc>
         <w:tc>
@@ -1093,7 +1113,9 @@
             <w:tcW w:type="dxa" w:w="1728"/>
           </w:tcPr>
           <w:p>
-            <w:r/>
+            <w:r>
+              <w:t>3.599e+08</w:t>
+            </w:r>
           </w:p>
         </w:tc>
         <w:tc>
@@ -1101,7 +1123,9 @@
             <w:tcW w:type="dxa" w:w="1728"/>
           </w:tcPr>
           <w:p>
-            <w:r/>
+            <w:r>
+              <w:t>2.501e+08</w:t>
+            </w:r>
           </w:p>
         </w:tc>
       </w:tr>
@@ -1156,7 +1180,7 @@
           </w:tcPr>
           <w:p>
             <w:r>
-              <w:t xml:space="preserve">    Min 1</w:t>
+              <w:t xml:space="preserve">  Min 1</w:t>
             </w:r>
           </w:p>
         </w:tc>
@@ -1165,7 +1189,9 @@
             <w:tcW w:type="dxa" w:w="1728"/>
           </w:tcPr>
           <w:p>
-            <w:r/>
+            <w:r>
+              <w:t>174.4</w:t>
+            </w:r>
           </w:p>
         </w:tc>
         <w:tc>
@@ -1173,7 +1199,9 @@
             <w:tcW w:type="dxa" w:w="1728"/>
           </w:tcPr>
           <w:p>
-            <w:r/>
+            <w:r>
+              <w:t>44.0</w:t>
+            </w:r>
           </w:p>
         </w:tc>
         <w:tc>
@@ -1181,7 +1209,9 @@
             <w:tcW w:type="dxa" w:w="1728"/>
           </w:tcPr>
           <w:p>
-            <w:r/>
+            <w:r>
+              <w:t>4.180e+08</w:t>
+            </w:r>
           </w:p>
         </w:tc>
         <w:tc>
@@ -1189,7 +1219,9 @@
             <w:tcW w:type="dxa" w:w="1728"/>
           </w:tcPr>
           <w:p>
-            <w:r/>
+            <w:r>
+              <w:t>2.153e+08</w:t>
+            </w:r>
           </w:p>
         </w:tc>
       </w:tr>
@@ -1200,7 +1232,7 @@
           </w:tcPr>
           <w:p>
             <w:r>
-              <w:t xml:space="preserve">    Max 1</w:t>
+              <w:t xml:space="preserve">  Max 1</w:t>
             </w:r>
           </w:p>
         </w:tc>
@@ -1209,7 +1241,9 @@
             <w:tcW w:type="dxa" w:w="1728"/>
           </w:tcPr>
           <w:p>
-            <w:r/>
+            <w:r>
+              <w:t>163.4</w:t>
+            </w:r>
           </w:p>
         </w:tc>
         <w:tc>
@@ -1217,7 +1251,9 @@
             <w:tcW w:type="dxa" w:w="1728"/>
           </w:tcPr>
           <w:p>
-            <w:r/>
+            <w:r>
+              <w:t>—</w:t>
+            </w:r>
           </w:p>
         </w:tc>
         <w:tc>
@@ -1225,7 +1261,9 @@
             <w:tcW w:type="dxa" w:w="1728"/>
           </w:tcPr>
           <w:p>
-            <w:r/>
+            <w:r>
+              <w:t>—</w:t>
+            </w:r>
           </w:p>
         </w:tc>
         <w:tc>
@@ -1233,7 +1271,9 @@
             <w:tcW w:type="dxa" w:w="1728"/>
           </w:tcPr>
           <w:p>
-            <w:r/>
+            <w:r>
+              <w:t>—</w:t>
+            </w:r>
           </w:p>
         </w:tc>
       </w:tr>
@@ -1244,7 +1284,7 @@
           </w:tcPr>
           <w:p>
             <w:r>
-              <w:t xml:space="preserve">    Min 2</w:t>
+              <w:t xml:space="preserve">  Min 2</w:t>
             </w:r>
           </w:p>
         </w:tc>
@@ -1253,7 +1293,9 @@
             <w:tcW w:type="dxa" w:w="1728"/>
           </w:tcPr>
           <w:p>
-            <w:r/>
+            <w:r>
+              <w:t>152.5</w:t>
+            </w:r>
           </w:p>
         </w:tc>
         <w:tc>
@@ -1261,7 +1303,9 @@
             <w:tcW w:type="dxa" w:w="1728"/>
           </w:tcPr>
           <w:p>
-            <w:r/>
+            <w:r>
+              <w:t>42.0</w:t>
+            </w:r>
           </w:p>
         </w:tc>
         <w:tc>
@@ -1269,7 +1313,9 @@
             <w:tcW w:type="dxa" w:w="1728"/>
           </w:tcPr>
           <w:p>
-            <w:r/>
+            <w:r>
+              <w:t>3.990e+08</w:t>
+            </w:r>
           </w:p>
         </w:tc>
         <w:tc>
@@ -1277,7 +1323,9 @@
             <w:tcW w:type="dxa" w:w="1728"/>
           </w:tcPr>
           <w:p>
-            <w:r/>
+            <w:r>
+              <w:t>2.256e+08</w:t>
+            </w:r>
           </w:p>
         </w:tc>
       </w:tr>
@@ -1288,7 +1336,7 @@
           </w:tcPr>
           <w:p>
             <w:r>
-              <w:t xml:space="preserve">    Max 2</w:t>
+              <w:t xml:space="preserve">  Max 2</w:t>
             </w:r>
           </w:p>
         </w:tc>
@@ -1297,7 +1345,9 @@
             <w:tcW w:type="dxa" w:w="1728"/>
           </w:tcPr>
           <w:p>
-            <w:r/>
+            <w:r>
+              <w:t>142.0</w:t>
+            </w:r>
           </w:p>
         </w:tc>
         <w:tc>
@@ -1305,7 +1355,9 @@
             <w:tcW w:type="dxa" w:w="1728"/>
           </w:tcPr>
           <w:p>
-            <w:r/>
+            <w:r>
+              <w:t>—</w:t>
+            </w:r>
           </w:p>
         </w:tc>
         <w:tc>
@@ -1313,7 +1365,9 @@
             <w:tcW w:type="dxa" w:w="1728"/>
           </w:tcPr>
           <w:p>
-            <w:r/>
+            <w:r>
+              <w:t>—</w:t>
+            </w:r>
           </w:p>
         </w:tc>
         <w:tc>
@@ -1321,7 +1375,9 @@
             <w:tcW w:type="dxa" w:w="1728"/>
           </w:tcPr>
           <w:p>
-            <w:r/>
+            <w:r>
+              <w:t>—</w:t>
+            </w:r>
           </w:p>
         </w:tc>
       </w:tr>
@@ -1332,7 +1388,7 @@
           </w:tcPr>
           <w:p>
             <w:r>
-              <w:t xml:space="preserve">    Min 3</w:t>
+              <w:t xml:space="preserve">  Min 3</w:t>
             </w:r>
           </w:p>
         </w:tc>
@@ -1341,7 +1397,9 @@
             <w:tcW w:type="dxa" w:w="1728"/>
           </w:tcPr>
           <w:p>
-            <w:r/>
+            <w:r>
+              <w:t>131.4</w:t>
+            </w:r>
           </w:p>
         </w:tc>
         <w:tc>
@@ -1349,7 +1407,9 @@
             <w:tcW w:type="dxa" w:w="1728"/>
           </w:tcPr>
           <w:p>
-            <w:r/>
+            <w:r>
+              <w:t>43.6</w:t>
+            </w:r>
           </w:p>
         </w:tc>
         <w:tc>
@@ -1357,7 +1417,9 @@
             <w:tcW w:type="dxa" w:w="1728"/>
           </w:tcPr>
           <w:p>
-            <w:r/>
+            <w:r>
+              <w:t>4.142e+08</w:t>
+            </w:r>
           </w:p>
         </w:tc>
         <w:tc>
@@ -1365,7 +1427,9 @@
             <w:tcW w:type="dxa" w:w="1728"/>
           </w:tcPr>
           <w:p>
-            <w:r/>
+            <w:r>
+              <w:t>2.173e+08</w:t>
+            </w:r>
           </w:p>
         </w:tc>
       </w:tr>
@@ -1376,7 +1440,7 @@
           </w:tcPr>
           <w:p>
             <w:r>
-              <w:t xml:space="preserve">    Max 3</w:t>
+              <w:t xml:space="preserve">  Max 3</w:t>
             </w:r>
           </w:p>
         </w:tc>
@@ -1385,7 +1449,9 @@
             <w:tcW w:type="dxa" w:w="1728"/>
           </w:tcPr>
           <w:p>
-            <w:r/>
+            <w:r>
+              <w:t>120.5</w:t>
+            </w:r>
           </w:p>
         </w:tc>
         <w:tc>
@@ -1393,7 +1459,9 @@
             <w:tcW w:type="dxa" w:w="1728"/>
           </w:tcPr>
           <w:p>
-            <w:r/>
+            <w:r>
+              <w:t>—</w:t>
+            </w:r>
           </w:p>
         </w:tc>
         <w:tc>
@@ -1401,7 +1469,9 @@
             <w:tcW w:type="dxa" w:w="1728"/>
           </w:tcPr>
           <w:p>
-            <w:r/>
+            <w:r>
+              <w:t>—</w:t>
+            </w:r>
           </w:p>
         </w:tc>
         <w:tc>
@@ -1409,7 +1479,9 @@
             <w:tcW w:type="dxa" w:w="1728"/>
           </w:tcPr>
           <w:p>
-            <w:r/>
+            <w:r>
+              <w:t>—</w:t>
+            </w:r>
           </w:p>
         </w:tc>
       </w:tr>
@@ -1437,7 +1509,9 @@
             <w:tcW w:type="dxa" w:w="1728"/>
           </w:tcPr>
           <w:p>
-            <w:r/>
+            <w:r>
+              <w:t>43.1</w:t>
+            </w:r>
           </w:p>
         </w:tc>
         <w:tc>
@@ -1445,7 +1519,9 @@
             <w:tcW w:type="dxa" w:w="1728"/>
           </w:tcPr>
           <w:p>
-            <w:r/>
+            <w:r>
+              <w:t>4.096e+08</w:t>
+            </w:r>
           </w:p>
         </w:tc>
         <w:tc>
@@ -1453,7 +1529,9 @@
             <w:tcW w:type="dxa" w:w="1728"/>
           </w:tcPr>
           <w:p>
-            <w:r/>
+            <w:r>
+              <w:t>2.197e+08</w:t>
+            </w:r>
           </w:p>
         </w:tc>
       </w:tr>
@@ -1508,7 +1586,7 @@
           </w:tcPr>
           <w:p>
             <w:r>
-              <w:t xml:space="preserve">    Min 1</w:t>
+              <w:t xml:space="preserve">  Min 1</w:t>
             </w:r>
           </w:p>
         </w:tc>
@@ -1517,7 +1595,9 @@
             <w:tcW w:type="dxa" w:w="1728"/>
           </w:tcPr>
           <w:p>
-            <w:r/>
+            <w:r>
+              <w:t>166.4</w:t>
+            </w:r>
           </w:p>
         </w:tc>
         <w:tc>
@@ -1525,7 +1605,9 @@
             <w:tcW w:type="dxa" w:w="1728"/>
           </w:tcPr>
           <w:p>
-            <w:r/>
+            <w:r>
+              <w:t>62.4</w:t>
+            </w:r>
           </w:p>
         </w:tc>
         <w:tc>
@@ -1533,7 +1615,9 @@
             <w:tcW w:type="dxa" w:w="1728"/>
           </w:tcPr>
           <w:p>
-            <w:r/>
+            <w:r>
+              <w:t>5.304e+08</w:t>
+            </w:r>
           </w:p>
         </w:tc>
         <w:tc>
@@ -1541,7 +1625,9 @@
             <w:tcW w:type="dxa" w:w="1728"/>
           </w:tcPr>
           <w:p>
-            <w:r/>
+            <w:r>
+              <w:t>1.697e+08</w:t>
+            </w:r>
           </w:p>
         </w:tc>
       </w:tr>
@@ -1552,7 +1638,7 @@
           </w:tcPr>
           <w:p>
             <w:r>
-              <w:t xml:space="preserve">    Max 1</w:t>
+              <w:t xml:space="preserve">  Max 1</w:t>
             </w:r>
           </w:p>
         </w:tc>
@@ -1561,7 +1647,9 @@
             <w:tcW w:type="dxa" w:w="1728"/>
           </w:tcPr>
           <w:p>
-            <w:r/>
+            <w:r>
+              <w:t>150.8</w:t>
+            </w:r>
           </w:p>
         </w:tc>
         <w:tc>
@@ -1569,7 +1657,9 @@
             <w:tcW w:type="dxa" w:w="1728"/>
           </w:tcPr>
           <w:p>
-            <w:r/>
+            <w:r>
+              <w:t>—</w:t>
+            </w:r>
           </w:p>
         </w:tc>
         <w:tc>
@@ -1577,7 +1667,9 @@
             <w:tcW w:type="dxa" w:w="1728"/>
           </w:tcPr>
           <w:p>
-            <w:r/>
+            <w:r>
+              <w:t>—</w:t>
+            </w:r>
           </w:p>
         </w:tc>
         <w:tc>
@@ -1585,7 +1677,9 @@
             <w:tcW w:type="dxa" w:w="1728"/>
           </w:tcPr>
           <w:p>
-            <w:r/>
+            <w:r>
+              <w:t>—</w:t>
+            </w:r>
           </w:p>
         </w:tc>
       </w:tr>
@@ -1596,7 +1690,7 @@
           </w:tcPr>
           <w:p>
             <w:r>
-              <w:t xml:space="preserve">    Min 2</w:t>
+              <w:t xml:space="preserve">  Min 2</w:t>
             </w:r>
           </w:p>
         </w:tc>
@@ -1605,7 +1699,9 @@
             <w:tcW w:type="dxa" w:w="1728"/>
           </w:tcPr>
           <w:p>
-            <w:r/>
+            <w:r>
+              <w:t>138.9</w:t>
+            </w:r>
           </w:p>
         </w:tc>
         <w:tc>
@@ -1613,7 +1709,9 @@
             <w:tcW w:type="dxa" w:w="1728"/>
           </w:tcPr>
           <w:p>
-            <w:r/>
+            <w:r>
+              <w:t>64.4</w:t>
+            </w:r>
           </w:p>
         </w:tc>
         <w:tc>
@@ -1621,7 +1719,9 @@
             <w:tcW w:type="dxa" w:w="1728"/>
           </w:tcPr>
           <w:p>
-            <w:r/>
+            <w:r>
+              <w:t>5.474e+08</w:t>
+            </w:r>
           </w:p>
         </w:tc>
         <w:tc>
@@ -1629,7 +1729,9 @@
             <w:tcW w:type="dxa" w:w="1728"/>
           </w:tcPr>
           <w:p>
-            <w:r/>
+            <w:r>
+              <w:t>1.644e+08</w:t>
+            </w:r>
           </w:p>
         </w:tc>
       </w:tr>
@@ -1640,7 +1742,7 @@
           </w:tcPr>
           <w:p>
             <w:r>
-              <w:t xml:space="preserve">    Max 2</w:t>
+              <w:t xml:space="preserve">  Max 2</w:t>
             </w:r>
           </w:p>
         </w:tc>
@@ -1649,7 +1751,9 @@
             <w:tcW w:type="dxa" w:w="1728"/>
           </w:tcPr>
           <w:p>
-            <w:r/>
+            <w:r>
+              <w:t>122.8</w:t>
+            </w:r>
           </w:p>
         </w:tc>
         <w:tc>
@@ -1657,7 +1761,9 @@
             <w:tcW w:type="dxa" w:w="1728"/>
           </w:tcPr>
           <w:p>
-            <w:r/>
+            <w:r>
+              <w:t>—</w:t>
+            </w:r>
           </w:p>
         </w:tc>
         <w:tc>
@@ -1665,7 +1771,9 @@
             <w:tcW w:type="dxa" w:w="1728"/>
           </w:tcPr>
           <w:p>
-            <w:r/>
+            <w:r>
+              <w:t>—</w:t>
+            </w:r>
           </w:p>
         </w:tc>
         <w:tc>
@@ -1673,7 +1781,9 @@
             <w:tcW w:type="dxa" w:w="1728"/>
           </w:tcPr>
           <w:p>
-            <w:r/>
+            <w:r>
+              <w:t>—</w:t>
+            </w:r>
           </w:p>
         </w:tc>
       </w:tr>
@@ -1684,7 +1794,7 @@
           </w:tcPr>
           <w:p>
             <w:r>
-              <w:t xml:space="preserve">    Min 3</w:t>
+              <w:t xml:space="preserve">  Min 3</w:t>
             </w:r>
           </w:p>
         </w:tc>
@@ -1693,7 +1803,9 @@
             <w:tcW w:type="dxa" w:w="1728"/>
           </w:tcPr>
           <w:p>
-            <w:r/>
+            <w:r>
+              <w:t>111.3</w:t>
+            </w:r>
           </w:p>
         </w:tc>
         <w:tc>
@@ -1701,7 +1813,9 @@
             <w:tcW w:type="dxa" w:w="1728"/>
           </w:tcPr>
           <w:p>
-            <w:r/>
+            <w:r>
+              <w:t>58.0</w:t>
+            </w:r>
           </w:p>
         </w:tc>
         <w:tc>
@@ -1709,7 +1823,9 @@
             <w:tcW w:type="dxa" w:w="1728"/>
           </w:tcPr>
           <w:p>
-            <w:r/>
+            <w:r>
+              <w:t>4.930e+08</w:t>
+            </w:r>
           </w:p>
         </w:tc>
         <w:tc>
@@ -1717,7 +1833,9 @@
             <w:tcW w:type="dxa" w:w="1728"/>
           </w:tcPr>
           <w:p>
-            <w:r/>
+            <w:r>
+              <w:t>1.826e+08</w:t>
+            </w:r>
           </w:p>
         </w:tc>
       </w:tr>
@@ -1728,7 +1846,7 @@
           </w:tcPr>
           <w:p>
             <w:r>
-              <w:t xml:space="preserve">    Max 3</w:t>
+              <w:t xml:space="preserve">  Max 3</w:t>
             </w:r>
           </w:p>
         </w:tc>
@@ -1737,7 +1855,9 @@
             <w:tcW w:type="dxa" w:w="1728"/>
           </w:tcPr>
           <w:p>
-            <w:r/>
+            <w:r>
+              <w:t>96.8</w:t>
+            </w:r>
           </w:p>
         </w:tc>
         <w:tc>
@@ -1745,7 +1865,9 @@
             <w:tcW w:type="dxa" w:w="1728"/>
           </w:tcPr>
           <w:p>
-            <w:r/>
+            <w:r>
+              <w:t>—</w:t>
+            </w:r>
           </w:p>
         </w:tc>
         <w:tc>
@@ -1753,7 +1875,9 @@
             <w:tcW w:type="dxa" w:w="1728"/>
           </w:tcPr>
           <w:p>
-            <w:r/>
+            <w:r>
+              <w:t>—</w:t>
+            </w:r>
           </w:p>
         </w:tc>
         <w:tc>
@@ -1761,7 +1885,9 @@
             <w:tcW w:type="dxa" w:w="1728"/>
           </w:tcPr>
           <w:p>
-            <w:r/>
+            <w:r>
+              <w:t>—</w:t>
+            </w:r>
           </w:p>
         </w:tc>
       </w:tr>
@@ -1789,7 +1915,9 @@
             <w:tcW w:type="dxa" w:w="1728"/>
           </w:tcPr>
           <w:p>
-            <w:r/>
+            <w:r>
+              <w:t>55.7</w:t>
+            </w:r>
           </w:p>
         </w:tc>
         <w:tc>
@@ -1797,7 +1925,9 @@
             <w:tcW w:type="dxa" w:w="1728"/>
           </w:tcPr>
           <w:p>
-            <w:r/>
+            <w:r>
+              <w:t>4.733e+08</w:t>
+            </w:r>
           </w:p>
         </w:tc>
         <w:tc>
@@ -1805,7 +1935,9 @@
             <w:tcW w:type="dxa" w:w="1728"/>
           </w:tcPr>
           <w:p>
-            <w:r/>
+            <w:r>
+              <w:t>1.902e+08</w:t>
+            </w:r>
           </w:p>
         </w:tc>
       </w:tr>
@@ -1816,7 +1948,6 @@
       </w:pPr>
       <w:r>
         <w:rPr>
-          <w:i w:val="0"/>
           <w:sz w:val="22"/>
         </w:rPr>
       </w:r>
@@ -1827,7 +1958,6 @@
       </w:pPr>
       <w:r>
         <w:rPr>
-          <w:i w:val="0"/>
           <w:sz w:val="22"/>
         </w:rPr>
         <w:t>Measured waveguide dimensions:</w:t>
@@ -1842,7 +1972,7 @@
         <w:rPr>
           <w:sz w:val="22"/>
         </w:rPr>
-        <w:t>a = _______ mm</w:t>
+        <w:t>a = 22.92 mm</w:t>
       </w:r>
     </w:p>
     <w:p>
@@ -1854,7 +1984,7 @@
         <w:rPr>
           <w:sz w:val="22"/>
         </w:rPr>
-        <w:t>b = _______ mm</w:t>
+        <w:t>b = 10.29 mm</w:t>
       </w:r>
     </w:p>
     <w:p>
@@ -1863,11 +1993,45 @@
       </w:pPr>
       <w:r>
         <w:rPr>
-          <w:i/>
-          <w:color w:val="888888"/>
           <w:sz w:val="22"/>
         </w:rPr>
-        <w:t>[Insert completed Table 3 data and any oscilloscope/SWR screenshots here]</w:t>
+        <w:t>Distance from short circuit to nearest detectable minimum:</w:t>
+      </w:r>
+    </w:p>
+    <w:p>
+      <w:pPr>
+        <w:pStyle w:val="ListBullet"/>
+        <w:spacing w:after="40"/>
+      </w:pPr>
+      <w:r>
+        <w:rPr>
+          <w:sz w:val="22"/>
+        </w:rPr>
+        <w:t>11 GHz:  83.5 mm</w:t>
+      </w:r>
+    </w:p>
+    <w:p>
+      <w:pPr>
+        <w:pStyle w:val="ListBullet"/>
+        <w:spacing w:after="40"/>
+      </w:pPr>
+      <w:r>
+        <w:rPr>
+          <w:sz w:val="22"/>
+        </w:rPr>
+        <w:t>9.5 GHz: 95.6 mm</w:t>
+      </w:r>
+    </w:p>
+    <w:p>
+      <w:pPr>
+        <w:pStyle w:val="ListBullet"/>
+        <w:spacing w:after="40"/>
+      </w:pPr>
+      <w:r>
+        <w:rPr>
+          <w:sz w:val="22"/>
+        </w:rPr>
+        <w:t>8.5 GHz: 85.4 mm</w:t>
       </w:r>
     </w:p>
     <w:p>
@@ -1900,7 +2064,6 @@
       </w:pPr>
       <w:r>
         <w:rPr>
-          <w:i w:val="0"/>
           <w:sz w:val="22"/>
         </w:rPr>
         <w:t>The free-space wavelength λ = c/f is the spatial period of the wave if it propagated in a straight line through free space at the speed of light. Inside the waveguide, the TE₁₀ mode can be visualized as two plane waves bouncing obliquely between the broad walls. These waves travel at an angle θ to the z-axis, so their axial phase advances more slowly than in free space. The resulting axial period — the waveguide wavelength λg = λ/√(1−(fc/f)²) — is always greater than λ and grows to infinity as f → fc.</w:t>
@@ -1924,7 +2087,6 @@
       </w:pPr>
       <w:r>
         <w:rPr>
-          <w:i w:val="0"/>
           <w:sz w:val="22"/>
         </w:rPr>
         <w:t>A short-circuit termination enforces the boundary condition that the tangential electric field is zero at the conducting end wall: E_tan = 0. The probe measures the tangential (transverse) E-field. Therefore, if the probe could be positioned exactly at the short circuit it would read zero signal — the short is a node of the standing wave.</w:t>
@@ -1948,10 +2110,9 @@
       </w:pPr>
       <w:r>
         <w:rPr>
-          <w:i w:val="0"/>
           <w:sz w:val="22"/>
         </w:rPr>
-        <w:t>The first true field minimum (node) occurs at the short circuit itself (z = 0). The next minimum is at z = λg/2. Since the probe carriage cannot physically reach the end of the waveguide, the nearest detectable minimum is at approximately z = λg/2 from the termination. Using the average measured λg:</w:t>
+        <w:t>The short circuit forces E = 0 at z = 0. Minima repeat every λg/2. The nearest detectable minimum is n × (λg/2) from the termination, where n is the smallest integer that places the minimum within probe reach.</w:t>
       </w:r>
     </w:p>
     <w:p>
@@ -1960,10 +2121,9 @@
       </w:pPr>
       <w:r>
         <w:rPr>
-          <w:i w:val="0"/>
           <w:sz w:val="22"/>
         </w:rPr>
-        <w:t xml:space="preserve">    d_min = λg/2 ≈ _______ mm  (to be filled in with measured data)</w:t>
+        <w:t>11 GHz:   λg/2 = 16.36 mm  →  n = 5  →  expected d = 81.80 mm,  measured = 83.5 mm,  % diff = 2.1%</w:t>
       </w:r>
     </w:p>
     <w:p>
@@ -1972,11 +2132,31 @@
       </w:pPr>
       <w:r>
         <w:rPr>
-          <w:i/>
-          <w:color w:val="888888"/>
           <w:sz w:val="22"/>
         </w:rPr>
-        <w:t>[Compare measured distance to calculated λg/2 and discuss agreement]</w:t>
+        <w:t>9.5 GHz:  λg/2 = 21.56 mm  →  n ≈ 4.43 → nearest int n = 4  →  expected d = 86.24 mm,  measured = 95.6 mm,  % diff = 10.9%</w:t>
+      </w:r>
+    </w:p>
+    <w:p>
+      <w:pPr>
+        <w:spacing w:after="80"/>
+      </w:pPr>
+      <w:r>
+        <w:rPr>
+          <w:sz w:val="22"/>
+        </w:rPr>
+        <w:t>8.5 GHz:  λg/2 = 27.84 mm  →  n = 3  →  expected d = 83.52 mm,  measured = 85.4 mm,  % diff = 2.3%</w:t>
+      </w:r>
+    </w:p>
+    <w:p>
+      <w:pPr>
+        <w:spacing w:after="80"/>
+      </w:pPr>
+      <w:r>
+        <w:rPr>
+          <w:sz w:val="22"/>
+        </w:rPr>
+        <w:t>The 11 GHz and 8.5 GHz results agree within ~2%, consistent with typical vernier scale reading error. The 9.5 GHz result shows larger discrepancy (~10%), likely due to probe alignment or a measurement made to a different minimum than expected.</w:t>
       </w:r>
     </w:p>
     <w:p>
@@ -1997,10 +2177,9 @@
       </w:pPr>
       <w:r>
         <w:rPr>
-          <w:i w:val="0"/>
           <w:sz w:val="22"/>
         </w:rPr>
-        <w:t>The short circuit forces a node at z = 0. The nearest detectable minimum is the first node the probe can reach, at a distance n·(λg/2) from the termination where n is a positive integer.</w:t>
+        <w:t>n = d_measured / (λg/2):</w:t>
       </w:r>
     </w:p>
     <w:p>
@@ -2009,11 +2188,31 @@
       </w:pPr>
       <w:r>
         <w:rPr>
-          <w:i/>
-          <w:color w:val="888888"/>
           <w:sz w:val="22"/>
         </w:rPr>
-        <w:t>[Calculate n = d_measured / (λg/2) and verify it is a whole number]</w:t>
+        <w:t>11 GHz:   n = 83.5 / 16.36 = 5.10  →  n = 5 half-wavelengths</w:t>
+      </w:r>
+    </w:p>
+    <w:p>
+      <w:pPr>
+        <w:spacing w:after="80"/>
+      </w:pPr>
+      <w:r>
+        <w:rPr>
+          <w:sz w:val="22"/>
+        </w:rPr>
+        <w:t>9.5 GHz:  n = 95.6 / 21.56 = 4.43  →  n ≈ 4 half-wavelengths (some measurement uncertainty)</w:t>
+      </w:r>
+    </w:p>
+    <w:p>
+      <w:pPr>
+        <w:spacing w:after="80"/>
+      </w:pPr>
+      <w:r>
+        <w:rPr>
+          <w:sz w:val="22"/>
+        </w:rPr>
+        <w:t>8.5 GHz:  n = 85.4 / 27.84 = 3.07  →  n = 3 half-wavelengths</w:t>
       </w:r>
     </w:p>
     <w:p>
@@ -2034,34 +2233,20 @@
       </w:pPr>
       <w:r>
         <w:rPr>
-          <w:i w:val="0"/>
           <w:sz w:val="22"/>
         </w:rPr>
-        <w:t>(a) IMPORTANT — the lab warns the three lowest modes may NOT be sequential m, n values. Use Eq. 3 to compute f_c for every candidate (m, n) pair, then rank them to find the actual three lowest. The general rule: TM requires m ≥ 1 AND n ≥ 1; TE allows either index to be zero (but not both). Whether TE₀₁ or TE₂₀ ranks second depends entirely on the ratio a/b — check both.</w:t>
+        <w:t>(a) Using a = 22.92 mm, b = 10.29 mm, c = 3×10⁸ m/s (Eq. 3):</w:t>
       </w:r>
     </w:p>
     <w:p>
       <w:pPr>
         <w:spacing w:after="80"/>
-      </w:pPr>
-      <w:r>
-        <w:rPr>
-          <w:i w:val="0"/>
-          <w:sz w:val="22"/>
-        </w:rPr>
-        <w:t>Candidate modes to evaluate with measured a and b:</w:t>
-      </w:r>
-    </w:p>
-    <w:p>
-      <w:pPr>
-        <w:pStyle w:val="ListBullet"/>
-        <w:spacing w:after="40"/>
       </w:pPr>
       <w:r>
         <w:rPr>
           <w:sz w:val="22"/>
         </w:rPr>
-        <w:t>TE₁₀:  f_c = c/(2a)                      = _______ GHz  ← always lowest</w:t>
+        <w:t>Only TE modes are relevant for the three lowest — TM requires m ≥ 1 AND n ≥ 1, so TM₁₁ is always higher than the lowest TE modes.</w:t>
       </w:r>
     </w:p>
     <w:p>
@@ -2073,7 +2258,7 @@
         <w:rPr>
           <w:sz w:val="22"/>
         </w:rPr>
-        <w:t>TE₂₀:  f_c = c/a                          = _______ GHz</w:t>
+        <w:t>TE₁₀  (m=1,n=0):  f_c = c/(2a)                    = 6.54 GHz  ← lowest</w:t>
       </w:r>
     </w:p>
     <w:p>
@@ -2085,7 +2270,7 @@
         <w:rPr>
           <w:sz w:val="22"/>
         </w:rPr>
-        <w:t>TE₀₁:  f_c = c/(2b)                       = _______ GHz</w:t>
+        <w:t>TE₂₀  (m=2,n=0):  f_c = c/a                      = 13.09 GHz</w:t>
       </w:r>
     </w:p>
     <w:p>
@@ -2097,19 +2282,19 @@
         <w:rPr>
           <w:sz w:val="22"/>
         </w:rPr>
-        <w:t>TE₁₁ / TM₁₁:  f_c = (c/2)√(1/a² + 1/b²) = _______ GHz</w:t>
+        <w:t>TE₀₁  (m=0,n=1):  f_c = c/(2b)                   = 14.58 GHz</w:t>
       </w:r>
     </w:p>
     <w:p>
       <w:pPr>
-        <w:spacing w:after="80"/>
+        <w:pStyle w:val="ListBullet"/>
+        <w:spacing w:after="40"/>
       </w:pPr>
       <w:r>
         <w:rPr>
-          <w:i w:val="0"/>
           <w:sz w:val="22"/>
         </w:rPr>
-        <w:t>Rank the four values above from lowest to highest — the top three are your answer. Note: for the standard X-band waveguide (a ≈ 2b) the order is TE₁₀ &lt; TE₂₀ &lt; TE₀₁, but confirm with your actual a and b measurements.</w:t>
+        <w:t>TE₁₁/TM₁₁       :  f_c = (c/2)√(1/a²+1/b²)     = 15.98 GHz  (4th — not in top 3)</w:t>
       </w:r>
     </w:p>
     <w:p>
@@ -2118,10 +2303,9 @@
       </w:pPr>
       <w:r>
         <w:rPr>
-          <w:i w:val="0"/>
           <w:sz w:val="22"/>
         </w:rPr>
-        <w:t>(b) Modes propagating at each frequency (f &gt; f_c required):</w:t>
+        <w:t>Three lowest: TE₁₀ (6.54 GHz) &lt; TE₂₀ (13.09 GHz) &lt; TE₀₁ (14.58 GHz).</w:t>
       </w:r>
     </w:p>
     <w:p>
@@ -2130,11 +2314,9 @@
       </w:pPr>
       <w:r>
         <w:rPr>
-          <w:i/>
-          <w:color w:val="888888"/>
           <w:sz w:val="22"/>
         </w:rPr>
-        <w:t>[For each operating frequency 11/9.5/8.5 GHz, list every mode whose f_c is below that frequency. At 11 GHz all three lowest modes likely propagate; at lower frequencies some may be cut off.]</w:t>
+        <w:t>(Note: a/b = 22.92/10.29 = 2.23 ≈ 2, confirming standard X-band ordering TE₁₀ &lt; TE₂₀ &lt; TE₀₁.)</w:t>
       </w:r>
     </w:p>
     <w:p>
@@ -2143,10 +2325,9 @@
       </w:pPr>
       <w:r>
         <w:rPr>
-          <w:i w:val="0"/>
           <w:sz w:val="22"/>
         </w:rPr>
-        <w:t>(c) Using free-space λ = c/f, average measured λg, and Eq. 5, back-calculate f_c via:  f_c = f √(1 − (λ/λg)²)  and compare to the geometric values from (a):</w:t>
+        <w:t>(b) Propagating modes (f &gt; f_c required):</w:t>
       </w:r>
     </w:p>
     <w:p>
@@ -2155,11 +2336,86 @@
       </w:pPr>
       <w:r>
         <w:rPr>
-          <w:i/>
-          <w:color w:val="888888"/>
           <w:sz w:val="22"/>
         </w:rPr>
-        <w:t>[Fill in one f_c per operating frequency. Agreement within ~5% is typical; larger discrepancy suggests probe loading or scale-reading error.]</w:t>
+        <w:t>All three operating frequencies (8.5, 9.5, 11 GHz) lie between TE₁₀ cutoff (6.54 GHz) and TE₂₀ cutoff (13.09 GHz).</w:t>
+      </w:r>
+    </w:p>
+    <w:p>
+      <w:pPr>
+        <w:spacing w:after="80"/>
+      </w:pPr>
+      <w:r>
+        <w:rPr>
+          <w:sz w:val="22"/>
+        </w:rPr>
+        <w:t>Therefore only TE₁₀ propagates at all three frequencies — single-mode operation throughout.</w:t>
+      </w:r>
+    </w:p>
+    <w:p>
+      <w:pPr>
+        <w:spacing w:after="80"/>
+      </w:pPr>
+      <w:r>
+        <w:rPr>
+          <w:sz w:val="22"/>
+        </w:rPr>
+        <w:t>(c) Back-calculating f_c from measured λg using f_c = f √(1 − (λ/λg)²):</w:t>
+      </w:r>
+    </w:p>
+    <w:p>
+      <w:pPr>
+        <w:spacing w:after="80"/>
+      </w:pPr>
+      <w:r>
+        <w:rPr>
+          <w:sz w:val="22"/>
+        </w:rPr>
+        <w:t>11 GHz:   λ = 27.27 mm,  λg = 32.72 mm  →  f_c = 6.08 GHz</w:t>
+      </w:r>
+    </w:p>
+    <w:p>
+      <w:pPr>
+        <w:spacing w:after="80"/>
+      </w:pPr>
+      <w:r>
+        <w:rPr>
+          <w:sz w:val="22"/>
+        </w:rPr>
+        <w:t>9.5 GHz:  λ = 31.58 mm,  λg = 43.12 mm  →  f_c = 6.47 GHz</w:t>
+      </w:r>
+    </w:p>
+    <w:p>
+      <w:pPr>
+        <w:spacing w:after="80"/>
+      </w:pPr>
+      <w:r>
+        <w:rPr>
+          <w:sz w:val="22"/>
+        </w:rPr>
+        <w:t>8.5 GHz:  λ = 35.29 mm,  λg = 55.68 mm  →  f_c = 6.57 GHz</w:t>
+      </w:r>
+    </w:p>
+    <w:p>
+      <w:pPr>
+        <w:spacing w:after="80"/>
+      </w:pPr>
+      <w:r>
+        <w:rPr>
+          <w:sz w:val="22"/>
+        </w:rPr>
+        <w:t>Average back-calculated f_c = 6.37 GHz  vs  geometric f_c (TE₁₀) = 6.54 GHz  →  % difference = 2.6%</w:t>
+      </w:r>
+    </w:p>
+    <w:p>
+      <w:pPr>
+        <w:spacing w:after="80"/>
+      </w:pPr>
+      <w:r>
+        <w:rPr>
+          <w:sz w:val="22"/>
+        </w:rPr>
+        <w:t>Agreement is within ~3%, consistent with minor probe loading and vernier scale reading error.</w:t>
       </w:r>
     </w:p>
     <w:p>
@@ -2197,7 +2453,6 @@
       </w:pPr>
       <w:r>
         <w:rPr>
-          <w:i w:val="0"/>
           <w:sz w:val="22"/>
         </w:rPr>
         <w:t>Use a tunable resonant cavity (HP X532B frequency meter) to independently measure the microwave frequency at each of the three oscillator settings (11 GHz, 9.5 GHz, 8.5 GHz). Compare the cavity-measured frequency to the oscillator dial setting and recalculate phase and group velocities.</w:t>
@@ -2221,10 +2476,9 @@
       </w:pPr>
       <w:r>
         <w:rPr>
-          <w:i w:val="0"/>
           <w:sz w:val="22"/>
         </w:rPr>
-        <w:t>A resonant cavity is a hollow metallic enclosure in which EM fields can oscillate at discrete resonant frequencies determined by its dimensions. When a signal at the resonant frequency passes through the cavity it is strongly absorbed (the cavity acts as a bandpass/notch filter), causing a pronounced dip in the SWR meter reading. By tuning the cavity until the SWR dip is maximized the resonant frequency — equal to the signal frequency — is read from the calibrated scale on the cavity side.</w:t>
+        <w:t>A resonant cavity is a hollow metallic enclosure in which EM fields oscillate at discrete resonant frequencies determined by its dimensions. When a signal at the resonant frequency passes through the cavity it is strongly absorbed, causing a pronounced dip in the SWR meter reading. Tuning the cavity until the SWR dip is greatest gives the signal frequency directly from the calibrated scale.</w:t>
       </w:r>
     </w:p>
     <w:p>
@@ -2233,10 +2487,9 @@
       </w:pPr>
       <w:r>
         <w:rPr>
-          <w:i w:val="0"/>
           <w:sz w:val="22"/>
         </w:rPr>
-        <w:t>Because the cavity frequency meter directly measures the wave frequency inside the waveguide, combining it with the waveguide wavelength λg measured in Experiment 1 allows an independent cross-check of the phase velocity via:</w:t>
+        <w:t>Combining the cavity-measured frequency with λg from Experiment 1 allows an independent cross-check of phase velocity:</w:t>
       </w:r>
     </w:p>
     <w:p>
@@ -2245,7 +2498,6 @@
       </w:pPr>
       <w:r>
         <w:rPr>
-          <w:i w:val="0"/>
           <w:sz w:val="22"/>
         </w:rPr>
         <w:t xml:space="preserve">    vp = λg · f     [Eq. 5]</w:t>
@@ -2257,22 +2509,9 @@
       </w:pPr>
       <w:r>
         <w:rPr>
-          <w:i w:val="0"/>
           <w:sz w:val="22"/>
         </w:rPr>
-        <w:t>and group velocity via:</w:t>
-      </w:r>
-    </w:p>
-    <w:p>
-      <w:pPr>
-        <w:spacing w:after="80"/>
-      </w:pPr>
-      <w:r>
-        <w:rPr>
-          <w:i w:val="0"/>
-          <w:sz w:val="22"/>
-        </w:rPr>
-        <w:t xml:space="preserve">    vg = (1/√με)(λ/λg) = c²/vp     [Eq. 6]</w:t>
+        <w:t xml:space="preserve">    vg = c² / vp    [Eq. 6]</w:t>
       </w:r>
     </w:p>
     <w:p>
@@ -2293,34 +2532,9 @@
       </w:pPr>
       <w:r>
         <w:rPr>
-          <w:i w:val="0"/>
           <w:sz w:val="22"/>
         </w:rPr>
-        <w:t>Equipment used: same as Experiment 1 with the addition of:</w:t>
-      </w:r>
-    </w:p>
-    <w:p>
-      <w:pPr>
-        <w:pStyle w:val="ListBullet"/>
-        <w:spacing w:after="40"/>
-      </w:pPr>
-      <w:r>
-        <w:rPr>
-          <w:sz w:val="22"/>
-        </w:rPr>
-        <w:t>HP X532B Tunable Cavity Frequency Meter (inserted between carriage and short circuit)</w:t>
-      </w:r>
-    </w:p>
-    <w:p>
-      <w:pPr>
-        <w:spacing w:after="80"/>
-      </w:pPr>
-      <w:r>
-        <w:rPr>
-          <w:i w:val="0"/>
-          <w:sz w:val="22"/>
-        </w:rPr>
-        <w:t>The short-circuit termination was moved to the output of the tunable cavity. The cavity was then attached to the output end of the slotted waveguide. The probe was positioned at a standing-wave maximum. The oscillator was set to 11 GHz. The cavity knob was slowly turned until the SWR meter showed its greatest dip; the frequency was then read from the calibrated scale on the cavity. The procedure was repeated for 9.5 GHz and 8.5 GHz.</w:t>
+        <w:t>Equipment: same as Experiment 1 with the addition of HP X532B Tunable Cavity Frequency Meter inserted between the carriage and the short-circuit termination. The probe was positioned at a standing-wave maximum. The cavity knob was tuned for maximum SWR dip at each oscillator frequency setting.</w:t>
       </w:r>
     </w:p>
     <w:p>
@@ -2344,7 +2558,7 @@
         <w:rPr>
           <w:sz w:val="22"/>
         </w:rPr>
-        <w:t>vp = λg · f  — phase velocity from frequency and waveguide wavelength (Eq. 5)</w:t>
+        <w:t>vp = λg · f  — phase velocity (Eq. 5)</w:t>
       </w:r>
     </w:p>
     <w:p>
@@ -2356,7 +2570,7 @@
         <w:rPr>
           <w:sz w:val="22"/>
         </w:rPr>
-        <w:t>vg = vp0 √(1−(fc/f)²)  — group velocity (Eq. 6)</w:t>
+        <w:t>vg = c² / vp  — group velocity (Eq. 6)</w:t>
       </w:r>
     </w:p>
     <w:p>
@@ -2368,7 +2582,7 @@
         <w:rPr>
           <w:sz w:val="22"/>
         </w:rPr>
-        <w:t>% difference = |v_measured − v_theory| / v_theory × 100%</w:t>
+        <w:t>% difference = |measured − expected| / expected × 100%</w:t>
       </w:r>
     </w:p>
     <w:p>
@@ -2389,7 +2603,6 @@
       </w:pPr>
       <w:r>
         <w:rPr>
-          <w:i w:val="0"/>
           <w:sz w:val="22"/>
         </w:rPr>
         <w:t>Table 2: Resonant cavity frequency measurements and derived velocities.</w:t>
@@ -2580,7 +2793,7 @@
           <w:color w:val="888888"/>
           <w:sz w:val="22"/>
         </w:rPr>
-        <w:t>[Insert completed Table 4 data and SWR dip photos/screenshots here]</w:t>
+        <w:t>[Insert Table 2 data after recording cavity frequencies]</w:t>
       </w:r>
     </w:p>
     <w:p>
@@ -2601,10 +2814,9 @@
       </w:pPr>
       <w:r>
         <w:rPr>
-          <w:i w:val="0"/>
           <w:sz w:val="22"/>
         </w:rPr>
-        <w:t>NOTE: The lab PDF (page 13) cuts off Experiment 2 Question 1 mid-sentence. Check your physical handout for the complete question list and update the placeholders below accordingly.</w:t>
+        <w:t>NOTE: The lab PDF cuts off Experiment 2 Q1 mid-sentence. Verify full questions from your physical handout.</w:t>
       </w:r>
     </w:p>
     <w:p>
@@ -2616,55 +2828,29 @@
           <w:b/>
           <w:sz w:val="24"/>
         </w:rPr>
-        <w:t>Q1 — Phase velocity: vp = λg · f  (lab PDF question, partially visible)</w:t>
+        <w:t>Q1 — Phase velocity: vp = λg · f</w:t>
       </w:r>
     </w:p>
     <w:p>
       <w:pPr>
         <w:spacing w:after="80"/>
-      </w:pPr>
-      <w:r>
-        <w:rPr>
-          <w:i w:val="0"/>
-          <w:sz w:val="22"/>
-        </w:rPr>
-        <w:t>The full question reads: "Using the measured values for frequency and wavelength, calculate the phase velocity of the wave: vp = λg · f. How close (i.e. percentage difference) is this to your values from [Experiment 1]?"</w:t>
-      </w:r>
-    </w:p>
-    <w:p>
-      <w:pPr>
-        <w:spacing w:after="80"/>
-      </w:pPr>
-      <w:r>
-        <w:rPr>
-          <w:i w:val="0"/>
-          <w:sz w:val="22"/>
-        </w:rPr>
-        <w:t>Using the cavity-measured frequency f_meas and the average λg from Experiment 1:</w:t>
-      </w:r>
-    </w:p>
-    <w:p>
-      <w:pPr>
-        <w:pStyle w:val="ListBullet"/>
-        <w:spacing w:after="40"/>
       </w:pPr>
       <w:r>
         <w:rPr>
           <w:sz w:val="22"/>
         </w:rPr>
-        <w:t>vp = λg(avg, 11 GHz) × f_meas(11 GHz)  = _______ m/s</w:t>
+        <w:t>The full question: "Using the measured values for frequency and wavelength, calculate the phase velocity of the wave: vp = λg · f. How close (i.e. percentage difference) is this to your values from Experiment 1?"</w:t>
       </w:r>
     </w:p>
     <w:p>
       <w:pPr>
-        <w:pStyle w:val="ListBullet"/>
-        <w:spacing w:after="40"/>
+        <w:spacing w:after="80"/>
       </w:pPr>
       <w:r>
         <w:rPr>
           <w:sz w:val="22"/>
         </w:rPr>
-        <w:t>vp = λg(avg, 9.5 GHz) × f_meas(9.5 GHz) = _______ m/s</w:t>
+        <w:t>Using cavity-measured frequency f_meas and average λg from Experiment 1:</w:t>
       </w:r>
     </w:p>
     <w:p>
@@ -2676,7 +2862,42 @@
         <w:rPr>
           <w:sz w:val="22"/>
         </w:rPr>
-        <w:t>vp = λg(avg, 8.5 GHz) × f_meas(8.5 GHz) = _______ m/s</w:t>
+        <w:t>vp(11 GHz)  = 32.72 mm × f_meas(11 GHz)  = [fill after recording f_meas]</w:t>
+      </w:r>
+    </w:p>
+    <w:p>
+      <w:pPr>
+        <w:pStyle w:val="ListBullet"/>
+        <w:spacing w:after="40"/>
+      </w:pPr>
+      <w:r>
+        <w:rPr>
+          <w:sz w:val="22"/>
+        </w:rPr>
+        <w:t>vp(9.5 GHz) = 43.12 mm × f_meas(9.5 GHz) = [fill after recording f_meas]</w:t>
+      </w:r>
+    </w:p>
+    <w:p>
+      <w:pPr>
+        <w:pStyle w:val="ListBullet"/>
+        <w:spacing w:after="40"/>
+      </w:pPr>
+      <w:r>
+        <w:rPr>
+          <w:sz w:val="22"/>
+        </w:rPr>
+        <w:t>vp(8.5 GHz) = 55.68 mm × f_meas(8.5 GHz) = [fill after recording f_meas]</w:t>
+      </w:r>
+    </w:p>
+    <w:p>
+      <w:pPr>
+        <w:spacing w:after="80"/>
+      </w:pPr>
+      <w:r>
+        <w:rPr>
+          <w:sz w:val="22"/>
+        </w:rPr>
+        <w:t>Experiment 1 reference vp values: 3.599e+08 m/s (11 GHz), 4.096e+08 m/s (9.5 GHz), 4.733e+08 m/s (8.5 GHz)</w:t>
       </w:r>
     </w:p>
     <w:p>
@@ -2689,7 +2910,7 @@
           <w:color w:val="888888"/>
           <w:sz w:val="22"/>
         </w:rPr>
-        <w:t>[Compute % difference = |vp_Exp2 − vp_Exp1| / vp_Exp1 × 100% for each frequency. Discuss sources of discrepancy: oscillator frequency drift, vernier scale reading error, probe loading effects.]</w:t>
+        <w:t>[Compute % difference once cavity frequencies are recorded]</w:t>
       </w:r>
     </w:p>
     <w:p>
@@ -2714,7 +2935,7 @@
           <w:color w:val="888888"/>
           <w:sz w:val="22"/>
         </w:rPr>
-        <w:t>[Write the complete question text here, then answer it. Likely asks about group velocity or comparing measured frequency to oscillator setting.]</w:t>
+        <w:t>[Write complete question then answer]</w:t>
       </w:r>
     </w:p>
     <w:p>
@@ -2739,7 +2960,7 @@
           <w:color w:val="888888"/>
           <w:sz w:val="22"/>
         </w:rPr>
-        <w:t>[Write the complete question text here, then answer it.]</w:t>
+        <w:t>[Write complete question then answer]</w:t>
       </w:r>
     </w:p>
     <w:sectPr>

</xml_diff>

<commit_message>
Remove photo/screenshot placeholders — lab only requires tables
</commit_message>
<xml_diff>
--- a/Labs/ECE332_Lab5_Waveguides.docx
+++ b/Labs/ECE332_Lab5_Waveguides.docx
@@ -2785,19 +2785,6 @@
     </w:tbl>
     <w:p>
       <w:pPr>
-        <w:spacing w:after="80"/>
-      </w:pPr>
-      <w:r>
-        <w:rPr>
-          <w:i/>
-          <w:color w:val="888888"/>
-          <w:sz w:val="22"/>
-        </w:rPr>
-        <w:t>[Insert Table 2 data after recording cavity frequencies]</w:t>
-      </w:r>
-    </w:p>
-    <w:p>
-      <w:pPr>
         <w:spacing w:before="200" w:after="80"/>
       </w:pPr>
       <w:r>

</xml_diff>

<commit_message>
Fill in Exp2 table and Q1 with cavity frequency measurements
</commit_message>
<xml_diff>
--- a/Labs/ECE332_Lab5_Waveguides.docx
+++ b/Labs/ECE332_Lab5_Waveguides.docx
@@ -2690,7 +2690,9 @@
             <w:tcW w:type="dxa" w:w="2160"/>
           </w:tcPr>
           <w:p>
-            <w:r/>
+            <w:r>
+              <w:t>11.050</w:t>
+            </w:r>
           </w:p>
         </w:tc>
         <w:tc>
@@ -2698,7 +2700,9 @@
             <w:tcW w:type="dxa" w:w="2160"/>
           </w:tcPr>
           <w:p>
-            <w:r/>
+            <w:r>
+              <w:t>2.489e+08</w:t>
+            </w:r>
           </w:p>
         </w:tc>
         <w:tc>
@@ -2706,7 +2710,9 @@
             <w:tcW w:type="dxa" w:w="2160"/>
           </w:tcPr>
           <w:p>
-            <w:r/>
+            <w:r>
+              <w:t>3.616e+08</w:t>
+            </w:r>
           </w:p>
         </w:tc>
       </w:tr>
@@ -2726,7 +2732,9 @@
             <w:tcW w:type="dxa" w:w="2160"/>
           </w:tcPr>
           <w:p>
-            <w:r/>
+            <w:r>
+              <w:t>9.405</w:t>
+            </w:r>
           </w:p>
         </w:tc>
         <w:tc>
@@ -2734,7 +2742,9 @@
             <w:tcW w:type="dxa" w:w="2160"/>
           </w:tcPr>
           <w:p>
-            <w:r/>
+            <w:r>
+              <w:t>2.219e+08</w:t>
+            </w:r>
           </w:p>
         </w:tc>
         <w:tc>
@@ -2742,7 +2752,9 @@
             <w:tcW w:type="dxa" w:w="2160"/>
           </w:tcPr>
           <w:p>
-            <w:r/>
+            <w:r>
+              <w:t>4.055e+08</w:t>
+            </w:r>
           </w:p>
         </w:tc>
       </w:tr>
@@ -2762,7 +2774,9 @@
             <w:tcW w:type="dxa" w:w="2160"/>
           </w:tcPr>
           <w:p>
-            <w:r/>
+            <w:r>
+              <w:t>8.515</w:t>
+            </w:r>
           </w:p>
         </w:tc>
         <w:tc>
@@ -2770,7 +2784,9 @@
             <w:tcW w:type="dxa" w:w="2160"/>
           </w:tcPr>
           <w:p>
-            <w:r/>
+            <w:r>
+              <w:t>1.898e+08</w:t>
+            </w:r>
           </w:p>
         </w:tc>
         <w:tc>
@@ -2778,7 +2794,9 @@
             <w:tcW w:type="dxa" w:w="2160"/>
           </w:tcPr>
           <w:p>
-            <w:r/>
+            <w:r>
+              <w:t>4.741e+08</w:t>
+            </w:r>
           </w:p>
         </w:tc>
       </w:tr>
@@ -2837,7 +2855,7 @@
         <w:rPr>
           <w:sz w:val="22"/>
         </w:rPr>
-        <w:t>Using cavity-measured frequency f_meas and average λg from Experiment 1:</w:t>
+        <w:t>Using cavity-measured frequency and average λg from Experiment 1:</w:t>
       </w:r>
     </w:p>
     <w:p>
@@ -2849,7 +2867,7 @@
         <w:rPr>
           <w:sz w:val="22"/>
         </w:rPr>
-        <w:t>vp(11 GHz)  = 32.72 mm × f_meas(11 GHz)  = [fill after recording f_meas]</w:t>
+        <w:t>vp(11 GHz)  = 32.72 mm × 11.050 GHz = 3.616e+08 m/s  (Exp 1: 3.599e+08 m/s,  % diff = 0.5%)</w:t>
       </w:r>
     </w:p>
     <w:p>
@@ -2861,7 +2879,7 @@
         <w:rPr>
           <w:sz w:val="22"/>
         </w:rPr>
-        <w:t>vp(9.5 GHz) = 43.12 mm × f_meas(9.5 GHz) = [fill after recording f_meas]</w:t>
+        <w:t>vp(9.5 GHz) = 43.12 mm × 9.405 GHz = 4.055e+08 m/s  (Exp 1: 4.096e+08 m/s,  % diff = 1.0%)</w:t>
       </w:r>
     </w:p>
     <w:p>
@@ -2873,7 +2891,7 @@
         <w:rPr>
           <w:sz w:val="22"/>
         </w:rPr>
-        <w:t>vp(8.5 GHz) = 55.68 mm × f_meas(8.5 GHz) = [fill after recording f_meas]</w:t>
+        <w:t>vp(8.5 GHz) = 55.68 mm × 8.515 GHz = 4.741e+08 m/s  (Exp 1: 4.733e+08 m/s,  % diff = 0.2%)</w:t>
       </w:r>
     </w:p>
     <w:p>
@@ -2884,20 +2902,7 @@
         <w:rPr>
           <w:sz w:val="22"/>
         </w:rPr>
-        <w:t>Experiment 1 reference vp values: 3.599e+08 m/s (11 GHz), 4.096e+08 m/s (9.5 GHz), 4.733e+08 m/s (8.5 GHz)</w:t>
-      </w:r>
-    </w:p>
-    <w:p>
-      <w:pPr>
-        <w:spacing w:after="80"/>
-      </w:pPr>
-      <w:r>
-        <w:rPr>
-          <w:i/>
-          <w:color w:val="888888"/>
-          <w:sz w:val="22"/>
-        </w:rPr>
-        <w:t>[Compute % difference once cavity frequencies are recorded]</w:t>
+        <w:t>All three values agree with Experiment 1 to within 1.1%, confirming that the oscillator frequency was close to the set value and that the waveguide wavelength measurements were accurate. Small discrepancies are attributable to vernier scale reading error and minor oscillator frequency drift.</w:t>
       </w:r>
     </w:p>
     <w:p>

</xml_diff>

<commit_message>
Complete all questions — Exp2 Q1 second part + Q2 group velocity
</commit_message>
<xml_diff>
--- a/Labs/ECE332_Lab5_Waveguides.docx
+++ b/Labs/ECE332_Lab5_Waveguides.docx
@@ -2902,7 +2902,18 @@
         <w:rPr>
           <w:sz w:val="22"/>
         </w:rPr>
-        <w:t>All three values agree with Experiment 1 to within 1.1%, confirming that the oscillator frequency was close to the set value and that the waveguide wavelength measurements were accurate. Small discrepancies are attributable to vernier scale reading error and minor oscillator frequency drift.</w:t>
+        <w:t>All three values agree with Experiment 1 to within 1.1%, confirming that the oscillator frequency was close to its set value and that the waveguide wavelength measurements were accurate. Small discrepancies are attributable to vernier scale reading error and minor oscillator frequency drift.</w:t>
+      </w:r>
+    </w:p>
+    <w:p>
+      <w:pPr>
+        <w:spacing w:after="80"/>
+      </w:pPr>
+      <w:r>
+        <w:rPr>
+          <w:sz w:val="22"/>
+        </w:rPr>
+        <w:t>Based on this, knowing the frequency accurately is important but not critical at this level. Since vp = λg · f, a 1% error in frequency directly produces a 1% error in vp. More critically, frequency accuracy matters for mode control: if the operating frequency drifted below the TE₂₀ cutoff (13.09 GHz) it could excite unwanted higher-order modes and corrupt measurements. The cavity meter confirms the oscillator stays within ~0.5% of its set value, which is sufficient for single-mode waveguide operation.</w:t>
       </w:r>
     </w:p>
     <w:p>
@@ -2914,7 +2925,7 @@
           <w:b/>
           <w:sz w:val="24"/>
         </w:rPr>
-        <w:t>Q2 — (verify full question from your handout)</w:t>
+        <w:t>Q2 — What happens to vg as f approaches fc?</w:t>
       </w:r>
     </w:p>
     <w:p>
@@ -2923,36 +2934,78 @@
       </w:pPr>
       <w:r>
         <w:rPr>
-          <w:i/>
-          <w:color w:val="888888"/>
           <w:sz w:val="22"/>
         </w:rPr>
-        <w:t>[Write complete question then answer]</w:t>
+        <w:t>From Eq. 6: vg = vp0 √(1 − (fc/f)²). As f → fc, the term (fc/f)² → 1, so √(1 − (fc/f)²) → 0 and therefore vg → 0.</w:t>
       </w:r>
     </w:p>
     <w:p>
       <w:pPr>
-        <w:spacing w:before="160" w:after="40"/>
+        <w:spacing w:after="80"/>
       </w:pPr>
       <w:r>
         <w:rPr>
-          <w:b/>
-          <w:sz w:val="24"/>
+          <w:sz w:val="22"/>
         </w:rPr>
-        <w:t>Q3 — (verify full question from your handout)</w:t>
+        <w:t>The measured data confirms this trend:</w:t>
       </w:r>
     </w:p>
     <w:p>
       <w:pPr>
-        <w:spacing w:after="80"/>
+        <w:pStyle w:val="ListBullet"/>
+        <w:spacing w:after="40"/>
       </w:pPr>
       <w:r>
         <w:rPr>
-          <w:i/>
-          <w:color w:val="888888"/>
           <w:sz w:val="22"/>
         </w:rPr>
-        <w:t>[Write complete question then answer]</w:t>
+        <w:t>f = 11 GHz  (f/fc = 1.68):  vg = 2.501e+08 m/s</w:t>
+      </w:r>
+    </w:p>
+    <w:p>
+      <w:pPr>
+        <w:pStyle w:val="ListBullet"/>
+        <w:spacing w:after="40"/>
+      </w:pPr>
+      <w:r>
+        <w:rPr>
+          <w:sz w:val="22"/>
+        </w:rPr>
+        <w:t>f = 9.5 GHz (f/fc = 1.45):  vg = 2.197e+08 m/s</w:t>
+      </w:r>
+    </w:p>
+    <w:p>
+      <w:pPr>
+        <w:pStyle w:val="ListBullet"/>
+        <w:spacing w:after="40"/>
+      </w:pPr>
+      <w:r>
+        <w:rPr>
+          <w:sz w:val="22"/>
+        </w:rPr>
+        <w:t>f = 8.5 GHz (f/fc = 1.30):  vg = 1.902e+08 m/s</w:t>
+      </w:r>
+    </w:p>
+    <w:p>
+      <w:pPr>
+        <w:spacing w:after="80"/>
+      </w:pPr>
+      <w:r>
+        <w:rPr>
+          <w:sz w:val="22"/>
+        </w:rPr>
+        <w:t>As frequency decreases toward fc = 6.54 GHz, vg drops from 2.50×10⁸ to 1.90×10⁸ m/s.</w:t>
+      </w:r>
+    </w:p>
+    <w:p>
+      <w:pPr>
+        <w:spacing w:after="80"/>
+      </w:pPr>
+      <w:r>
+        <w:rPr>
+          <w:sz w:val="22"/>
+        </w:rPr>
+        <w:t>Physical explanation: the TE₁₀ mode can be visualized as two plane waves bouncing obliquely between the broad walls at angle θ to the z-axis, where sin θ = fc/f. As f → fc, θ → 90° — the waves bounce nearly perpendicular to the axis with almost no net axial advance. Energy is trapped bouncing transversely and travels axially more and more slowly. At exactly f = fc the waves bounce straight across (θ = 90°) and vg = 0 — the mode can exist but carries no energy along the guide. Below cutoff the mode becomes evanescent and decays exponentially.</w:t>
       </w:r>
     </w:p>
     <w:sectPr>

</xml_diff>

<commit_message>
Remove stale NOTE about PDF cutoff
</commit_message>
<xml_diff>
--- a/Labs/ECE332_Lab5_Waveguides.docx
+++ b/Labs/ECE332_Lab5_Waveguides.docx
@@ -2815,17 +2815,6 @@
     </w:p>
     <w:p>
       <w:pPr>
-        <w:spacing w:after="80"/>
-      </w:pPr>
-      <w:r>
-        <w:rPr>
-          <w:sz w:val="22"/>
-        </w:rPr>
-        <w:t>NOTE: The lab PDF cuts off Experiment 2 Q1 mid-sentence. Verify full questions from your physical handout.</w:t>
-      </w:r>
-    </w:p>
-    <w:p>
-      <w:pPr>
         <w:spacing w:before="160" w:after="40"/>
       </w:pPr>
       <w:r>
@@ -2844,7 +2833,7 @@
         <w:rPr>
           <w:sz w:val="22"/>
         </w:rPr>
-        <w:t>The full question: "Using the measured values for frequency and wavelength, calculate the phase velocity of the wave: vp = λg · f. How close (i.e. percentage difference) is this to your values from Experiment 1?"</w:t>
+        <w:t>Using the measured values for frequency and wavelength, calculate the phase velocity of the wave: vp = λg · f. How close (i.e. percentage difference) is this to your values from Experiment 3.1? Based on this, how important is it to know the frequency accurately?</w:t>
       </w:r>
     </w:p>
     <w:p>

</xml_diff>